<commit_message>
lap -> PC: Inovación
</commit_message>
<xml_diff>
--- a/TAREAS 6 SEMESTRE/Inovación y Tecnología/Resumen1.docx
+++ b/TAREAS 6 SEMESTRE/Inovación y Tecnología/Resumen1.docx
@@ -1274,7 +1274,7 @@
                                 <w:sz w:val="40"/>
                                 <w:szCs w:val="44"/>
                               </w:rPr>
-                              <w:t>Rodolfo algo</w:t>
+                              <w:t>Ascencio Salinas Rodolfo</w:t>
                             </w:r>
                             <w:r>
                               <w:rPr>
@@ -1351,7 +1351,11 @@
           </mc:Choice>
           <mc:Fallback>
             <w:pict>
-              <v:shape w14:anchorId="4382B185" id="Cuadro de texto 283" o:spid="_x0000_s1029" type="#_x0000_t202" style="position:absolute;left:0;text-align:left;margin-left:70.15pt;margin-top:11.05pt;width:439.35pt;height:171.15pt;z-index:251655168;visibility:visible;mso-wrap-style:square;mso-width-percent:0;mso-height-percent:0;mso-wrap-distance-left:9pt;mso-wrap-distance-top:0;mso-wrap-distance-right:9pt;mso-wrap-distance-bottom:0;mso-position-horizontal:absolute;mso-position-horizontal-relative:page;mso-position-vertical:absolute;mso-position-vertical-relative:text;mso-width-percent:0;mso-height-percent:0;mso-width-relative:margin;mso-height-relative:margin;v-text-anchor:top" o:gfxdata="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" filled="f" strokecolor="#81685d [1614]" strokeweight="3pt">
+              <v:shapetype w14:anchorId="4382B185" id="_x0000_t202" coordsize="21600,21600" o:spt="202" path="m,l,21600r21600,l21600,xe">
+                <v:stroke joinstyle="miter"/>
+                <v:path gradientshapeok="t" o:connecttype="rect"/>
+              </v:shapetype>
+              <v:shape id="Cuadro de texto 283" o:spid="_x0000_s1029" type="#_x0000_t202" style="position:absolute;left:0;text-align:left;margin-left:70.15pt;margin-top:11.05pt;width:439.35pt;height:171.15pt;z-index:251655168;visibility:visible;mso-wrap-style:square;mso-width-percent:0;mso-height-percent:0;mso-wrap-distance-left:9pt;mso-wrap-distance-top:0;mso-wrap-distance-right:9pt;mso-wrap-distance-bottom:0;mso-position-horizontal:absolute;mso-position-horizontal-relative:page;mso-position-vertical:absolute;mso-position-vertical-relative:text;mso-width-percent:0;mso-height-percent:0;mso-width-relative:margin;mso-height-relative:margin;v-text-anchor:top" o:gfxdata="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" filled="f" strokecolor="#81685d [1614]" strokeweight="3pt">
                 <v:stroke dashstyle="longDashDotDot"/>
                 <v:textbox>
                   <w:txbxContent>
@@ -1468,7 +1472,7 @@
                           <w:sz w:val="40"/>
                           <w:szCs w:val="44"/>
                         </w:rPr>
-                        <w:t>Rodolfo algo</w:t>
+                        <w:t>Ascencio Salinas Rodolfo</w:t>
                       </w:r>
                       <w:r>
                         <w:rPr>
@@ -2027,7 +2031,67 @@
       <w:r>
         <w:t>s enciclopedias desde 1768 fue el líder indiscutible en este campo</w:t>
       </w:r>
+      <w:r>
+        <w:t>. Pero, todo esto cambió con la llegada de internet. La empresa británica 244 años después anunció que estaría lanzando su última versión, dando por hecho que el internet había derrotado por completo a la empresa de renombre. Y su oponente, Wikipedia se conformó como el sitio libre y de acceso gratuito para cualquiera que desee acceder a la información.</w:t>
+      </w:r>
     </w:p>
+    <w:p>
+      <w:r>
+        <w:tab/>
+        <w:t xml:space="preserve">A pesar de que no fue el primer contrincante digital </w:t>
+      </w:r>
+      <w:r>
+        <w:t>al que se enfrento la empresa británica, pues Encarta de Microsoft con su estrategia para brindar software educativo, Wikipedia lo destronó al cubrir fugas que la enciclopedia tradicional nunca pudo abarcar. A esto es a lo que se refiere con aprender a adaptarse a la digitalización.</w:t>
+      </w:r>
+    </w:p>
+    <w:p>
+      <w:r>
+        <w:lastRenderedPageBreak/>
+        <w:tab/>
+        <w:t xml:space="preserve">Más adelante </w:t>
+      </w:r>
+      <w:r>
+        <w:t>se mostró como la empresa fue capaz de adoptar la era tecnológica para persistir con el paso del tiempo. Su estrategia fue implementar todas sus enciclopedias en digital bajo suscripción, manteniendo la idea de ser una fuente confiable y de calidad.</w:t>
+      </w:r>
+    </w:p>
+    <w:p>
+      <w:pPr>
+        <w:pStyle w:val="Ttulo2"/>
+      </w:pPr>
+      <w:r>
+        <w:t>Superar los ángulos muertos digitales</w:t>
+      </w:r>
+    </w:p>
+    <w:p>
+      <w:r>
+        <w:tab/>
+      </w:r>
+      <w:r>
+        <w:t xml:space="preserve">Se utiliza la siguiente analogía: Durate la primera ola de la Revolución Industrial, las fábricas dependían de fuentes de energía fijas, primero, de la energía fijas, primero, </w:t>
+      </w:r>
+      <w:r>
+        <w:t>de la</w:t>
+      </w:r>
+      <w:r>
+        <w:t xml:space="preserve"> en</w:t>
+      </w:r>
+      <w:r>
+        <w:t>er</w:t>
+      </w:r>
+      <w:r>
+        <w:t xml:space="preserve">gía hidráulica de las norias situadas a lo largo de los ríos y, más tarde, de la energía de vapor de los motores de carbón. Aunque estas fuentes de energía permitieron el aumento de la producción en masa, también establecieron limitaciones fundamentales. Al principio, determinaban dónde podían ser. </w:t>
+      </w:r>
+      <w:r>
+        <w:t>Además,</w:t>
+      </w:r>
+      <w:r>
+        <w:t xml:space="preserve"> dado que</w:t>
+      </w:r>
+      <w:r>
+        <w:t xml:space="preserve"> tanto las ruedas hidráulicas como los motores de vapor exigían que todo el equipo de una fábrica se acoplara a un eje de trasmisión central. </w:t>
+      </w:r>
+    </w:p>
+    <w:p/>
     <w:p>
       <w:pPr>
         <w:pStyle w:val="Ttulo1"/>
@@ -2052,7 +2116,6 @@
       </w:pPr>
       <w:bookmarkStart w:id="3" w:name="_Toc220850613"/>
       <w:r>
-        <w:lastRenderedPageBreak/>
         <w:t>Bibliografía</w:t>
       </w:r>
       <w:bookmarkEnd w:id="3"/>
@@ -6385,6 +6448,7 @@
   <w:style w:type="character" w:default="1" w:styleId="Fuentedeprrafopredeter">
     <w:name w:val="Default Paragraph Font"/>
     <w:uiPriority w:val="1"/>
+    <w:semiHidden/>
     <w:unhideWhenUsed/>
   </w:style>
   <w:style w:type="table" w:default="1" w:styleId="Tablanormal">

</xml_diff>

<commit_message>
lap -> PC: Resumen 1 y Paralela y TR
</commit_message>
<xml_diff>
--- a/TAREAS 6 SEMESTRE/Inovación y Tecnología/Resumen1.docx
+++ b/TAREAS 6 SEMESTRE/Inovación y Tecnología/Resumen1.docx
@@ -1351,11 +1351,7 @@
           </mc:Choice>
           <mc:Fallback>
             <w:pict>
-              <v:shapetype w14:anchorId="4382B185" id="_x0000_t202" coordsize="21600,21600" o:spt="202" path="m,l,21600r21600,l21600,xe">
-                <v:stroke joinstyle="miter"/>
-                <v:path gradientshapeok="t" o:connecttype="rect"/>
-              </v:shapetype>
-              <v:shape id="Cuadro de texto 283" o:spid="_x0000_s1029" type="#_x0000_t202" style="position:absolute;left:0;text-align:left;margin-left:70.15pt;margin-top:11.05pt;width:439.35pt;height:171.15pt;z-index:251655168;visibility:visible;mso-wrap-style:square;mso-width-percent:0;mso-height-percent:0;mso-wrap-distance-left:9pt;mso-wrap-distance-top:0;mso-wrap-distance-right:9pt;mso-wrap-distance-bottom:0;mso-position-horizontal:absolute;mso-position-horizontal-relative:page;mso-position-vertical:absolute;mso-position-vertical-relative:text;mso-width-percent:0;mso-height-percent:0;mso-width-relative:margin;mso-height-relative:margin;v-text-anchor:top" o:gfxdata="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" filled="f" strokecolor="#81685d [1614]" strokeweight="3pt">
+              <v:shape w14:anchorId="4382B185" id="Cuadro de texto 283" o:spid="_x0000_s1029" type="#_x0000_t202" style="position:absolute;left:0;text-align:left;margin-left:70.15pt;margin-top:11.05pt;width:439.35pt;height:171.15pt;z-index:251655168;visibility:visible;mso-wrap-style:square;mso-width-percent:0;mso-height-percent:0;mso-wrap-distance-left:9pt;mso-wrap-distance-top:0;mso-wrap-distance-right:9pt;mso-wrap-distance-bottom:0;mso-position-horizontal:absolute;mso-position-horizontal-relative:page;mso-position-vertical:absolute;mso-position-vertical-relative:text;mso-width-percent:0;mso-height-percent:0;mso-width-relative:margin;mso-height-relative:margin;v-text-anchor:top" o:gfxdata="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" filled="f" strokecolor="#81685d [1614]" strokeweight="3pt">
                 <v:stroke dashstyle="longDashDotDot"/>
                 <v:textbox>
                   <w:txbxContent>
@@ -2088,10 +2084,121 @@
         <w:t xml:space="preserve"> dado que</w:t>
       </w:r>
       <w:r>
-        <w:t xml:space="preserve"> tanto las ruedas hidráulicas como los motores de vapor exigían que todo el equipo de una fábrica se acoplara a un eje de trasmisión central. </w:t>
+        <w:t xml:space="preserve"> tanto las ruedas hidráulicas como los motores de vapor exigían que todo el equipo de una fábrica se acoplara a un eje de trasmisión central</w:t>
+      </w:r>
+      <w:r>
+        <w:t>, hacía que esas fuentes de energía determinaran el diseño de las fábricas y la forma n que se podría trabajar en ellas.</w:t>
       </w:r>
     </w:p>
-    <w:p/>
+    <w:p>
+      <w:r>
+        <w:tab/>
+        <w:t>Una vez que las instalaciones eléctricas se comenzaron a llegar a las fábricas los empresarios seguían aferrados a los diseños grandes de los que dependían anteriormente. Y se notó con las nuevas empresas que llegaron que innovaron con las nuevas tecnologías, y sigue pasando con las nuevas tecnologías que llegan.</w:t>
+      </w:r>
+    </w:p>
+    <w:p>
+      <w:pPr>
+        <w:pStyle w:val="Ttulo2"/>
+      </w:pPr>
+      <w:r>
+        <w:t>Cinco dominios de la estrategia que la tecnología digital está cambiando</w:t>
+      </w:r>
+    </w:p>
+    <w:p>
+      <w:pPr>
+        <w:ind w:firstLine="708"/>
+      </w:pPr>
+      <w:r>
+        <w:t xml:space="preserve">Si la llegada de la electricidad fue un cambio drástico en la era industrial, lo que ha causado la era digital ha sido exponencialmente gigantesco. La era digital hoy en día permite hacer pruebas con el producto antes de sacarlo al mercado, conocer las opiniones de un producto en tiempo real, generar esquemas de negocios, conocer a la competencia, el almacenamiento masivo de datos, la persistencia de estos y un sinfín de mejoras. </w:t>
+      </w:r>
+    </w:p>
+    <w:p>
+      <w:pPr>
+        <w:ind w:firstLine="708"/>
+      </w:pPr>
+      <w:r>
+        <w:t>Las tecnologías nos obligan a pensar de manera diferente sobre como entendemos y creamos valor para el cliente. Además, que reforman en cómo se están reconfigurando los cinco dominios clave en la transformación</w:t>
+      </w:r>
+    </w:p>
+    <w:p>
+      <w:pPr>
+        <w:pStyle w:val="Ttulo1"/>
+        <w:tabs>
+          <w:tab w:val="left" w:pos="4800"/>
+        </w:tabs>
+      </w:pPr>
+      <w:r>
+        <w:t>Los Cinco Dominios de la Transformación Digital</w:t>
+      </w:r>
+    </w:p>
+    <w:p>
+      <w:pPr>
+        <w:pStyle w:val="Ttulo2"/>
+      </w:pPr>
+      <w:r>
+        <w:t>Clientes</w:t>
+      </w:r>
+    </w:p>
+    <w:p>
+      <w:r>
+        <w:tab/>
+      </w:r>
+      <w:r>
+        <w:t xml:space="preserve">Antes, a los clientes se los trataba como un conglomerado de actores que eran independientes entre sí y las empresas producían para la mayor cantidad de personas que pudieran. Ahora los clientes </w:t>
+      </w:r>
+      <w:r>
+        <w:t xml:space="preserve">están dinámicamente conectados e interactúan de </w:t>
+      </w:r>
+      <w:r>
+        <w:lastRenderedPageBreak/>
+        <w:t>manera que cambian tanto las relaciones entre ellos como con las empresas, estos se influyen y determinan la reputación de las empresas y de las marcas.</w:t>
+      </w:r>
+    </w:p>
+    <w:p>
+      <w:pPr>
+        <w:pStyle w:val="Ttulo2"/>
+      </w:pPr>
+      <w:r>
+        <w:t>Competencia</w:t>
+      </w:r>
+    </w:p>
+    <w:p>
+      <w:r>
+        <w:tab/>
+        <w:t xml:space="preserve">Este dominio se enfoca en cómo las empresas compiten dentro del mercado para satisfacer a sus clientes y cómo tradicionalmente se consideraba que la cooperación y </w:t>
+      </w:r>
+      <w:r>
+        <w:t>la competencia se consideraban como opuestos; las empresas competían con empresas rivales que se parecían mucho a ellas y cooperaban con socios de la cadena de suministro que distribuían sus bienes o proporcionaban los insumos necesarios</w:t>
+      </w:r>
+      <w:r>
+        <w:t xml:space="preserve"> </w:t>
+      </w:r>
+      <w:r>
+        <w:t>para su producción. Ahora mismo está dinámica es totalmente distinta pues muchas veces los verdaderos rivales son aquellas empresas que pueden prescindir de nosotros y ofrecen un servicio muy competitivo al nuestro. Las empresas que se asemejan ir a la par ahora pueden resultar ser de gran apoyo pues muchas veces requieren llegar a la misma meta y para ello se puede prestar a compartir tecnologías y avances para combatir rivales de otros sectores.</w:t>
+      </w:r>
+    </w:p>
+    <w:p>
+      <w:pPr>
+        <w:pStyle w:val="Ttulo2"/>
+      </w:pPr>
+      <w:r>
+        <w:t>Datos</w:t>
+      </w:r>
+    </w:p>
+    <w:p>
+      <w:r>
+        <w:tab/>
+        <w:t xml:space="preserve">Anteriormente los datos se producían a través de una variedad de mediciones planificadas que se realizaban dentro de los </w:t>
+      </w:r>
+      <w:proofErr w:type="spellStart"/>
+      <w:r>
+        <w:t>propiaos</w:t>
+      </w:r>
+      <w:proofErr w:type="spellEnd"/>
+      <w:r>
+        <w:t xml:space="preserve"> procesos de una empresa: </w:t>
+      </w:r>
+    </w:p>
     <w:p>
       <w:pPr>
         <w:pStyle w:val="Ttulo1"/>
@@ -2108,6 +2215,9 @@
       </w:pPr>
       <w:r>
         <w:t>Hola soy una conclusión</w:t>
+      </w:r>
+      <w:r>
+        <w:t xml:space="preserve"> </w:t>
       </w:r>
     </w:p>
     <w:p>

</xml_diff>

<commit_message>
Resumen 1 - Inovación: Terminado
</commit_message>
<xml_diff>
--- a/TAREAS 6 SEMESTRE/Inovación y Tecnología/Resumen1.docx
+++ b/TAREAS 6 SEMESTRE/Inovación y Tecnología/Resumen1.docx
@@ -1540,7 +1540,7 @@
         <w:br w:type="page"/>
       </w:r>
     </w:p>
-    <w:bookmarkStart w:id="0" w:name="_Toc220850609" w:displacedByCustomXml="next"/>
+    <w:bookmarkStart w:id="0" w:name="_Toc239234984" w:displacedByCustomXml="next"/>
     <w:sdt>
       <w:sdtPr>
         <w:rPr>
@@ -1607,7 +1607,7 @@
           <w:r>
             <w:fldChar w:fldCharType="separate"/>
           </w:r>
-          <w:hyperlink w:anchor="_Toc220850609" w:history="1">
+          <w:hyperlink w:anchor="_Toc239234984" w:history="1">
             <w:r>
               <w:rPr>
                 <w:rStyle w:val="Hipervnculo"/>
@@ -1635,7 +1635,7 @@
                 <w:noProof/>
                 <w:webHidden/>
               </w:rPr>
-              <w:instrText xml:space="preserve"> PAGEREF _Toc220850609 \h </w:instrText>
+              <w:instrText xml:space="preserve"> PAGEREF _Toc239234984 \h </w:instrText>
             </w:r>
             <w:r>
               <w:rPr>
@@ -1678,7 +1678,7 @@
               <w:color w:val="auto"/>
             </w:rPr>
           </w:pPr>
-          <w:hyperlink w:anchor="_Toc220850610" w:history="1">
+          <w:hyperlink w:anchor="_Toc239234985" w:history="1">
             <w:r>
               <w:rPr>
                 <w:rStyle w:val="Hipervnculo"/>
@@ -1705,7 +1705,7 @@
                 <w:noProof/>
                 <w:webHidden/>
               </w:rPr>
-              <w:instrText xml:space="preserve"> PAGEREF _Toc220850610 \h </w:instrText>
+              <w:instrText xml:space="preserve"> PAGEREF _Toc239234985 \h </w:instrText>
             </w:r>
             <w:r>
               <w:rPr>
@@ -1748,13 +1748,13 @@
               <w:color w:val="auto"/>
             </w:rPr>
           </w:pPr>
-          <w:hyperlink w:anchor="_Toc220850611" w:history="1">
+          <w:hyperlink w:anchor="_Toc239234986" w:history="1">
             <w:r>
               <w:rPr>
                 <w:rStyle w:val="Hipervnculo"/>
                 <w:noProof/>
               </w:rPr>
-              <w:t>Desarrollo</w:t>
+              <w:t>Introducción</w:t>
             </w:r>
             <w:r>
               <w:rPr>
@@ -1775,7 +1775,7 @@
                 <w:noProof/>
                 <w:webHidden/>
               </w:rPr>
-              <w:instrText xml:space="preserve"> PAGEREF _Toc220850611 \h </w:instrText>
+              <w:instrText xml:space="preserve"> PAGEREF _Toc239234986 \h </w:instrText>
             </w:r>
             <w:r>
               <w:rPr>
@@ -1796,6 +1796,216 @@
                 <w:webHidden/>
               </w:rPr>
               <w:t>1</w:t>
+            </w:r>
+            <w:r>
+              <w:rPr>
+                <w:noProof/>
+                <w:webHidden/>
+              </w:rPr>
+              <w:fldChar w:fldCharType="end"/>
+            </w:r>
+          </w:hyperlink>
+        </w:p>
+        <w:p>
+          <w:pPr>
+            <w:pStyle w:val="TDC2"/>
+            <w:tabs>
+              <w:tab w:val="right" w:leader="dot" w:pos="9111"/>
+            </w:tabs>
+            <w:rPr>
+              <w:rFonts w:asciiTheme="minorHAnsi" w:eastAsiaTheme="minorEastAsia" w:hAnsiTheme="minorHAnsi" w:cstheme="minorBidi"/>
+              <w:noProof/>
+              <w:color w:val="auto"/>
+            </w:rPr>
+          </w:pPr>
+          <w:hyperlink w:anchor="_Toc239234987" w:history="1">
+            <w:r>
+              <w:rPr>
+                <w:rStyle w:val="Hipervnculo"/>
+                <w:noProof/>
+              </w:rPr>
+              <w:t>Ejemplo</w:t>
+            </w:r>
+            <w:r>
+              <w:rPr>
+                <w:noProof/>
+                <w:webHidden/>
+              </w:rPr>
+              <w:tab/>
+            </w:r>
+            <w:r>
+              <w:rPr>
+                <w:noProof/>
+                <w:webHidden/>
+              </w:rPr>
+              <w:fldChar w:fldCharType="begin"/>
+            </w:r>
+            <w:r>
+              <w:rPr>
+                <w:noProof/>
+                <w:webHidden/>
+              </w:rPr>
+              <w:instrText xml:space="preserve"> PAGEREF _Toc239234987 \h </w:instrText>
+            </w:r>
+            <w:r>
+              <w:rPr>
+                <w:noProof/>
+                <w:webHidden/>
+              </w:rPr>
+            </w:r>
+            <w:r>
+              <w:rPr>
+                <w:noProof/>
+                <w:webHidden/>
+              </w:rPr>
+              <w:fldChar w:fldCharType="separate"/>
+            </w:r>
+            <w:r>
+              <w:rPr>
+                <w:noProof/>
+                <w:webHidden/>
+              </w:rPr>
+              <w:t>1</w:t>
+            </w:r>
+            <w:r>
+              <w:rPr>
+                <w:noProof/>
+                <w:webHidden/>
+              </w:rPr>
+              <w:fldChar w:fldCharType="end"/>
+            </w:r>
+          </w:hyperlink>
+        </w:p>
+        <w:p>
+          <w:pPr>
+            <w:pStyle w:val="TDC2"/>
+            <w:tabs>
+              <w:tab w:val="right" w:leader="dot" w:pos="9111"/>
+            </w:tabs>
+            <w:rPr>
+              <w:rFonts w:asciiTheme="minorHAnsi" w:eastAsiaTheme="minorEastAsia" w:hAnsiTheme="minorHAnsi" w:cstheme="minorBidi"/>
+              <w:noProof/>
+              <w:color w:val="auto"/>
+            </w:rPr>
+          </w:pPr>
+          <w:hyperlink w:anchor="_Toc239234988" w:history="1">
+            <w:r>
+              <w:rPr>
+                <w:rStyle w:val="Hipervnculo"/>
+                <w:noProof/>
+              </w:rPr>
+              <w:t>Superar los ángulos muertos digitales</w:t>
+            </w:r>
+            <w:r>
+              <w:rPr>
+                <w:noProof/>
+                <w:webHidden/>
+              </w:rPr>
+              <w:tab/>
+            </w:r>
+            <w:r>
+              <w:rPr>
+                <w:noProof/>
+                <w:webHidden/>
+              </w:rPr>
+              <w:fldChar w:fldCharType="begin"/>
+            </w:r>
+            <w:r>
+              <w:rPr>
+                <w:noProof/>
+                <w:webHidden/>
+              </w:rPr>
+              <w:instrText xml:space="preserve"> PAGEREF _Toc239234988 \h </w:instrText>
+            </w:r>
+            <w:r>
+              <w:rPr>
+                <w:noProof/>
+                <w:webHidden/>
+              </w:rPr>
+            </w:r>
+            <w:r>
+              <w:rPr>
+                <w:noProof/>
+                <w:webHidden/>
+              </w:rPr>
+              <w:fldChar w:fldCharType="separate"/>
+            </w:r>
+            <w:r>
+              <w:rPr>
+                <w:noProof/>
+                <w:webHidden/>
+              </w:rPr>
+              <w:t>2</w:t>
+            </w:r>
+            <w:r>
+              <w:rPr>
+                <w:noProof/>
+                <w:webHidden/>
+              </w:rPr>
+              <w:fldChar w:fldCharType="end"/>
+            </w:r>
+          </w:hyperlink>
+        </w:p>
+        <w:p>
+          <w:pPr>
+            <w:pStyle w:val="TDC2"/>
+            <w:tabs>
+              <w:tab w:val="right" w:leader="dot" w:pos="9111"/>
+            </w:tabs>
+            <w:rPr>
+              <w:rFonts w:asciiTheme="minorHAnsi" w:eastAsiaTheme="minorEastAsia" w:hAnsiTheme="minorHAnsi" w:cstheme="minorBidi"/>
+              <w:noProof/>
+              <w:color w:val="auto"/>
+            </w:rPr>
+          </w:pPr>
+          <w:hyperlink w:anchor="_Toc239234989" w:history="1">
+            <w:r>
+              <w:rPr>
+                <w:rStyle w:val="Hipervnculo"/>
+                <w:noProof/>
+              </w:rPr>
+              <w:t>Cinco dominios de la estrategia que la tecnología digital está cambiando</w:t>
+            </w:r>
+            <w:r>
+              <w:rPr>
+                <w:noProof/>
+                <w:webHidden/>
+              </w:rPr>
+              <w:tab/>
+            </w:r>
+            <w:r>
+              <w:rPr>
+                <w:noProof/>
+                <w:webHidden/>
+              </w:rPr>
+              <w:fldChar w:fldCharType="begin"/>
+            </w:r>
+            <w:r>
+              <w:rPr>
+                <w:noProof/>
+                <w:webHidden/>
+              </w:rPr>
+              <w:instrText xml:space="preserve"> PAGEREF _Toc239234989 \h </w:instrText>
+            </w:r>
+            <w:r>
+              <w:rPr>
+                <w:noProof/>
+                <w:webHidden/>
+              </w:rPr>
+            </w:r>
+            <w:r>
+              <w:rPr>
+                <w:noProof/>
+                <w:webHidden/>
+              </w:rPr>
+              <w:fldChar w:fldCharType="separate"/>
+            </w:r>
+            <w:r>
+              <w:rPr>
+                <w:noProof/>
+                <w:webHidden/>
+              </w:rPr>
+              <w:t>2</w:t>
             </w:r>
             <w:r>
               <w:rPr>
@@ -1818,13 +2028,13 @@
               <w:color w:val="auto"/>
             </w:rPr>
           </w:pPr>
-          <w:hyperlink w:anchor="_Toc220850612" w:history="1">
+          <w:hyperlink w:anchor="_Toc239234990" w:history="1">
             <w:r>
               <w:rPr>
                 <w:rStyle w:val="Hipervnculo"/>
                 <w:noProof/>
               </w:rPr>
-              <w:t>Conclusión</w:t>
+              <w:t>Los Cinco Dominios de la Transformación Digital</w:t>
             </w:r>
             <w:r>
               <w:rPr>
@@ -1845,7 +2055,7 @@
                 <w:noProof/>
                 <w:webHidden/>
               </w:rPr>
-              <w:instrText xml:space="preserve"> PAGEREF _Toc220850612 \h </w:instrText>
+              <w:instrText xml:space="preserve"> PAGEREF _Toc239234990 \h </w:instrText>
             </w:r>
             <w:r>
               <w:rPr>
@@ -1865,7 +2075,287 @@
                 <w:noProof/>
                 <w:webHidden/>
               </w:rPr>
-              <w:t>1</w:t>
+              <w:t>3</w:t>
+            </w:r>
+            <w:r>
+              <w:rPr>
+                <w:noProof/>
+                <w:webHidden/>
+              </w:rPr>
+              <w:fldChar w:fldCharType="end"/>
+            </w:r>
+          </w:hyperlink>
+        </w:p>
+        <w:p>
+          <w:pPr>
+            <w:pStyle w:val="TDC2"/>
+            <w:tabs>
+              <w:tab w:val="right" w:leader="dot" w:pos="9111"/>
+            </w:tabs>
+            <w:rPr>
+              <w:rFonts w:asciiTheme="minorHAnsi" w:eastAsiaTheme="minorEastAsia" w:hAnsiTheme="minorHAnsi" w:cstheme="minorBidi"/>
+              <w:noProof/>
+              <w:color w:val="auto"/>
+            </w:rPr>
+          </w:pPr>
+          <w:hyperlink w:anchor="_Toc239234991" w:history="1">
+            <w:r>
+              <w:rPr>
+                <w:rStyle w:val="Hipervnculo"/>
+                <w:noProof/>
+              </w:rPr>
+              <w:t>Clientes</w:t>
+            </w:r>
+            <w:r>
+              <w:rPr>
+                <w:noProof/>
+                <w:webHidden/>
+              </w:rPr>
+              <w:tab/>
+            </w:r>
+            <w:r>
+              <w:rPr>
+                <w:noProof/>
+                <w:webHidden/>
+              </w:rPr>
+              <w:fldChar w:fldCharType="begin"/>
+            </w:r>
+            <w:r>
+              <w:rPr>
+                <w:noProof/>
+                <w:webHidden/>
+              </w:rPr>
+              <w:instrText xml:space="preserve"> PAGEREF _Toc239234991 \h </w:instrText>
+            </w:r>
+            <w:r>
+              <w:rPr>
+                <w:noProof/>
+                <w:webHidden/>
+              </w:rPr>
+            </w:r>
+            <w:r>
+              <w:rPr>
+                <w:noProof/>
+                <w:webHidden/>
+              </w:rPr>
+              <w:fldChar w:fldCharType="separate"/>
+            </w:r>
+            <w:r>
+              <w:rPr>
+                <w:noProof/>
+                <w:webHidden/>
+              </w:rPr>
+              <w:t>3</w:t>
+            </w:r>
+            <w:r>
+              <w:rPr>
+                <w:noProof/>
+                <w:webHidden/>
+              </w:rPr>
+              <w:fldChar w:fldCharType="end"/>
+            </w:r>
+          </w:hyperlink>
+        </w:p>
+        <w:p>
+          <w:pPr>
+            <w:pStyle w:val="TDC2"/>
+            <w:tabs>
+              <w:tab w:val="right" w:leader="dot" w:pos="9111"/>
+            </w:tabs>
+            <w:rPr>
+              <w:rFonts w:asciiTheme="minorHAnsi" w:eastAsiaTheme="minorEastAsia" w:hAnsiTheme="minorHAnsi" w:cstheme="minorBidi"/>
+              <w:noProof/>
+              <w:color w:val="auto"/>
+            </w:rPr>
+          </w:pPr>
+          <w:hyperlink w:anchor="_Toc239234992" w:history="1">
+            <w:r>
+              <w:rPr>
+                <w:rStyle w:val="Hipervnculo"/>
+                <w:noProof/>
+              </w:rPr>
+              <w:t>Competencia</w:t>
+            </w:r>
+            <w:r>
+              <w:rPr>
+                <w:noProof/>
+                <w:webHidden/>
+              </w:rPr>
+              <w:tab/>
+            </w:r>
+            <w:r>
+              <w:rPr>
+                <w:noProof/>
+                <w:webHidden/>
+              </w:rPr>
+              <w:fldChar w:fldCharType="begin"/>
+            </w:r>
+            <w:r>
+              <w:rPr>
+                <w:noProof/>
+                <w:webHidden/>
+              </w:rPr>
+              <w:instrText xml:space="preserve"> PAGEREF _Toc239234992 \h </w:instrText>
+            </w:r>
+            <w:r>
+              <w:rPr>
+                <w:noProof/>
+                <w:webHidden/>
+              </w:rPr>
+            </w:r>
+            <w:r>
+              <w:rPr>
+                <w:noProof/>
+                <w:webHidden/>
+              </w:rPr>
+              <w:fldChar w:fldCharType="separate"/>
+            </w:r>
+            <w:r>
+              <w:rPr>
+                <w:noProof/>
+                <w:webHidden/>
+              </w:rPr>
+              <w:t>3</w:t>
+            </w:r>
+            <w:r>
+              <w:rPr>
+                <w:noProof/>
+                <w:webHidden/>
+              </w:rPr>
+              <w:fldChar w:fldCharType="end"/>
+            </w:r>
+          </w:hyperlink>
+        </w:p>
+        <w:p>
+          <w:pPr>
+            <w:pStyle w:val="TDC2"/>
+            <w:tabs>
+              <w:tab w:val="right" w:leader="dot" w:pos="9111"/>
+            </w:tabs>
+            <w:rPr>
+              <w:rFonts w:asciiTheme="minorHAnsi" w:eastAsiaTheme="minorEastAsia" w:hAnsiTheme="minorHAnsi" w:cstheme="minorBidi"/>
+              <w:noProof/>
+              <w:color w:val="auto"/>
+            </w:rPr>
+          </w:pPr>
+          <w:hyperlink w:anchor="_Toc239234993" w:history="1">
+            <w:r>
+              <w:rPr>
+                <w:rStyle w:val="Hipervnculo"/>
+                <w:noProof/>
+              </w:rPr>
+              <w:t>Datos</w:t>
+            </w:r>
+            <w:r>
+              <w:rPr>
+                <w:noProof/>
+                <w:webHidden/>
+              </w:rPr>
+              <w:tab/>
+            </w:r>
+            <w:r>
+              <w:rPr>
+                <w:noProof/>
+                <w:webHidden/>
+              </w:rPr>
+              <w:fldChar w:fldCharType="begin"/>
+            </w:r>
+            <w:r>
+              <w:rPr>
+                <w:noProof/>
+                <w:webHidden/>
+              </w:rPr>
+              <w:instrText xml:space="preserve"> PAGEREF _Toc239234993 \h </w:instrText>
+            </w:r>
+            <w:r>
+              <w:rPr>
+                <w:noProof/>
+                <w:webHidden/>
+              </w:rPr>
+            </w:r>
+            <w:r>
+              <w:rPr>
+                <w:noProof/>
+                <w:webHidden/>
+              </w:rPr>
+              <w:fldChar w:fldCharType="separate"/>
+            </w:r>
+            <w:r>
+              <w:rPr>
+                <w:noProof/>
+                <w:webHidden/>
+              </w:rPr>
+              <w:t>3</w:t>
+            </w:r>
+            <w:r>
+              <w:rPr>
+                <w:noProof/>
+                <w:webHidden/>
+              </w:rPr>
+              <w:fldChar w:fldCharType="end"/>
+            </w:r>
+          </w:hyperlink>
+        </w:p>
+        <w:p>
+          <w:pPr>
+            <w:pStyle w:val="TDC2"/>
+            <w:tabs>
+              <w:tab w:val="right" w:leader="dot" w:pos="9111"/>
+            </w:tabs>
+            <w:rPr>
+              <w:rFonts w:asciiTheme="minorHAnsi" w:eastAsiaTheme="minorEastAsia" w:hAnsiTheme="minorHAnsi" w:cstheme="minorBidi"/>
+              <w:noProof/>
+              <w:color w:val="auto"/>
+            </w:rPr>
+          </w:pPr>
+          <w:hyperlink w:anchor="_Toc239234994" w:history="1">
+            <w:r>
+              <w:rPr>
+                <w:rStyle w:val="Hipervnculo"/>
+                <w:noProof/>
+              </w:rPr>
+              <w:t>Innovación</w:t>
+            </w:r>
+            <w:r>
+              <w:rPr>
+                <w:noProof/>
+                <w:webHidden/>
+              </w:rPr>
+              <w:tab/>
+            </w:r>
+            <w:r>
+              <w:rPr>
+                <w:noProof/>
+                <w:webHidden/>
+              </w:rPr>
+              <w:fldChar w:fldCharType="begin"/>
+            </w:r>
+            <w:r>
+              <w:rPr>
+                <w:noProof/>
+                <w:webHidden/>
+              </w:rPr>
+              <w:instrText xml:space="preserve"> PAGEREF _Toc239234994 \h </w:instrText>
+            </w:r>
+            <w:r>
+              <w:rPr>
+                <w:noProof/>
+                <w:webHidden/>
+              </w:rPr>
+            </w:r>
+            <w:r>
+              <w:rPr>
+                <w:noProof/>
+                <w:webHidden/>
+              </w:rPr>
+              <w:fldChar w:fldCharType="separate"/>
+            </w:r>
+            <w:r>
+              <w:rPr>
+                <w:noProof/>
+                <w:webHidden/>
+              </w:rPr>
+              <w:t>4</w:t>
             </w:r>
             <w:r>
               <w:rPr>
@@ -1888,12 +2378,82 @@
               <w:color w:val="auto"/>
             </w:rPr>
           </w:pPr>
-          <w:hyperlink w:anchor="_Toc220850613" w:history="1">
+          <w:hyperlink w:anchor="_Toc239234995" w:history="1">
             <w:r>
               <w:rPr>
                 <w:rStyle w:val="Hipervnculo"/>
                 <w:noProof/>
               </w:rPr>
+              <w:t>Una Guía Estratégica de la Transformación Digital</w:t>
+            </w:r>
+            <w:r>
+              <w:rPr>
+                <w:noProof/>
+                <w:webHidden/>
+              </w:rPr>
+              <w:tab/>
+            </w:r>
+            <w:r>
+              <w:rPr>
+                <w:noProof/>
+                <w:webHidden/>
+              </w:rPr>
+              <w:fldChar w:fldCharType="begin"/>
+            </w:r>
+            <w:r>
+              <w:rPr>
+                <w:noProof/>
+                <w:webHidden/>
+              </w:rPr>
+              <w:instrText xml:space="preserve"> PAGEREF _Toc239234995 \h </w:instrText>
+            </w:r>
+            <w:r>
+              <w:rPr>
+                <w:noProof/>
+                <w:webHidden/>
+              </w:rPr>
+            </w:r>
+            <w:r>
+              <w:rPr>
+                <w:noProof/>
+                <w:webHidden/>
+              </w:rPr>
+              <w:fldChar w:fldCharType="separate"/>
+            </w:r>
+            <w:r>
+              <w:rPr>
+                <w:noProof/>
+                <w:webHidden/>
+              </w:rPr>
+              <w:t>4</w:t>
+            </w:r>
+            <w:r>
+              <w:rPr>
+                <w:noProof/>
+                <w:webHidden/>
+              </w:rPr>
+              <w:fldChar w:fldCharType="end"/>
+            </w:r>
+          </w:hyperlink>
+        </w:p>
+        <w:p>
+          <w:pPr>
+            <w:pStyle w:val="TDC1"/>
+            <w:tabs>
+              <w:tab w:val="right" w:leader="dot" w:pos="9111"/>
+            </w:tabs>
+            <w:rPr>
+              <w:rFonts w:asciiTheme="minorHAnsi" w:eastAsiaTheme="minorEastAsia" w:hAnsiTheme="minorHAnsi" w:cstheme="minorBidi"/>
+              <w:noProof/>
+              <w:color w:val="auto"/>
+            </w:rPr>
+          </w:pPr>
+          <w:hyperlink w:anchor="_Toc239234996" w:history="1">
+            <w:r>
+              <w:rPr>
+                <w:rStyle w:val="Hipervnculo"/>
+                <w:noProof/>
+              </w:rPr>
               <w:t>Bibliografía</w:t>
             </w:r>
             <w:r>
@@ -1915,7 +2475,7 @@
                 <w:noProof/>
                 <w:webHidden/>
               </w:rPr>
-              <w:instrText xml:space="preserve"> PAGEREF _Toc220850613 \h </w:instrText>
+              <w:instrText xml:space="preserve"> PAGEREF _Toc239234996 \h </w:instrText>
             </w:r>
             <w:r>
               <w:rPr>
@@ -1935,7 +2495,7 @@
                 <w:noProof/>
                 <w:webHidden/>
               </w:rPr>
-              <w:t>1</w:t>
+              <w:t>5</w:t>
             </w:r>
             <w:r>
               <w:rPr>
@@ -1958,151 +2518,139 @@
         </w:p>
       </w:sdtContent>
     </w:sdt>
+    <w:p/>
     <w:p>
       <w:pPr>
         <w:pStyle w:val="Ttulo1"/>
       </w:pPr>
-      <w:bookmarkStart w:id="1" w:name="_Toc220850610"/>
-      <w:r>
-        <w:t>Tabla de ilustraciones</w:t>
+      <w:bookmarkStart w:id="1" w:name="_Toc239234986"/>
+      <w:r>
+        <w:t>Introducción</w:t>
       </w:r>
       <w:bookmarkEnd w:id="1"/>
     </w:p>
     <w:p>
-      <w:fldSimple w:instr=" TOC \h \z \c &quot;Ilustración&quot; ">
-        <w:r>
-          <w:rPr>
-            <w:b/>
-            <w:bCs/>
-            <w:noProof/>
-            <w:lang w:val="es-ES"/>
-          </w:rPr>
-          <w:t>No se encuentran elementos de tabla de ilustraciones.</w:t>
-        </w:r>
-      </w:fldSimple>
-    </w:p>
-    <w:p/>
-    <w:p>
-      <w:pPr>
-        <w:pStyle w:val="Ttulo1"/>
-      </w:pPr>
-      <w:r>
-        <w:t>Introducción</w:t>
+      <w:r>
+        <w:tab/>
+        <w:t>Este libro nos introduce en la transformación digita de ideas, negocios y empresas por m</w:t>
+      </w:r>
+      <w:r>
+        <w:t>5</w:t>
+      </w:r>
+      <w:r>
+        <w:t>edio de un ejemplo bastante concreto, cómo fue que ocurrió el cam</w:t>
+      </w:r>
+      <w:r>
+        <w:t>bio y cómo debemos adaptarnos al cambio. Nos da un breve resumen de los capítulos siguientes y de cómo es que debemos tomar este libro, pues es una guía que funciona no solo en el ámbito empresarial o de marketing, sino también revela la manera en que las ideas deben de adaptarse y aprovechar el mundo digital.</w:t>
       </w:r>
     </w:p>
     <w:p>
-      <w:r>
-        <w:tab/>
-        <w:t>Este libro nos introduce en la transformación digita de ideas, negocios y empresas por m</w:t>
-      </w:r>
-      <w:r>
-        <w:t>5</w:t>
-      </w:r>
-      <w:r>
-        <w:t>edio de un ejemplo bastante concreto, cómo fue que ocurrió el cam</w:t>
-      </w:r>
-      <w:r>
-        <w:t>bio y cómo debemos adaptarnos al cambio. Nos da un breve resumen de los capítulos siguientes y de cómo es que debemos tomar este libro, pues es una guía que funciona no solo en el ámbito empresarial o de marketing, sino también revela la manera en que las ideas deben de adaptarse y aprovechar el mundo digital.</w:t>
-      </w:r>
+      <w:pPr>
+        <w:pStyle w:val="Ttulo2"/>
+      </w:pPr>
+      <w:bookmarkStart w:id="2" w:name="_Toc239234987"/>
+      <w:r>
+        <w:t>Ejemplo</w:t>
+      </w:r>
+      <w:bookmarkEnd w:id="2"/>
     </w:p>
     <w:p>
-      <w:pPr>
-        <w:pStyle w:val="Ttulo2"/>
-      </w:pPr>
-      <w:r>
-        <w:t>Ejemplo</w:t>
+      <w:r>
+        <w:tab/>
+        <w:t xml:space="preserve">Las enciclopedias fueron </w:t>
+      </w:r>
+      <w:r>
+        <w:t>un gran aporte</w:t>
+      </w:r>
+      <w:r>
+        <w:t xml:space="preserve"> a la educación e investigación pues era un vasto recurso de treinta y dos volúmenes. La Enciclopedia Británica Inc., la empresa encargada de publicar y distribuir la</w:t>
+      </w:r>
+      <w:r>
+        <w:t>s enciclopedias desde 1768 fue el líder indiscutible en este campo</w:t>
+      </w:r>
+      <w:r>
+        <w:t xml:space="preserve">. Pero, todo esto cambió con la llegada de internet. La empresa británica 244 años después anunció que estaría lanzando su última versión, dando por hecho que el internet había derrotado por completo a la empresa de renombre. Y su oponente, </w:t>
+      </w:r>
+      <w:r>
+        <w:lastRenderedPageBreak/>
+        <w:t>Wikipedia se conformó como el sitio libre y de acceso gratuito para cualquiera que desee acceder a la información.</w:t>
       </w:r>
     </w:p>
     <w:p>
       <w:r>
         <w:tab/>
-        <w:t xml:space="preserve">Las enciclopedias fueron </w:t>
-      </w:r>
-      <w:r>
-        <w:t>un gran aporte</w:t>
-      </w:r>
-      <w:r>
-        <w:t xml:space="preserve"> a la educación e investigación pues era un vasto recurso de treinta y dos volúmenes. La Enciclopedia Británica Inc., la empresa encargada de publicar y distribuir la</w:t>
-      </w:r>
-      <w:r>
-        <w:t>s enciclopedias desde 1768 fue el líder indiscutible en este campo</w:t>
-      </w:r>
-      <w:r>
-        <w:t>. Pero, todo esto cambió con la llegada de internet. La empresa británica 244 años después anunció que estaría lanzando su última versión, dando por hecho que el internet había derrotado por completo a la empresa de renombre. Y su oponente, Wikipedia se conformó como el sitio libre y de acceso gratuito para cualquiera que desee acceder a la información.</w:t>
+        <w:t xml:space="preserve">A pesar de que no fue el primer contrincante digital </w:t>
+      </w:r>
+      <w:r>
+        <w:t>al que se enfrento la empresa británica, pues Encarta de Microsoft con su estrategia para brindar software educativo, Wikipedia lo destronó al cubrir fugas que la enciclopedia tradicional nunca pudo abarcar. A esto es a lo que se refiere con aprender a adaptarse a la digitalización.</w:t>
       </w:r>
     </w:p>
     <w:p>
       <w:r>
         <w:tab/>
-        <w:t xml:space="preserve">A pesar de que no fue el primer contrincante digital </w:t>
-      </w:r>
-      <w:r>
-        <w:t>al que se enfrento la empresa británica, pues Encarta de Microsoft con su estrategia para brindar software educativo, Wikipedia lo destronó al cubrir fugas que la enciclopedia tradicional nunca pudo abarcar. A esto es a lo que se refiere con aprender a adaptarse a la digitalización.</w:t>
+        <w:t xml:space="preserve">Más adelante </w:t>
+      </w:r>
+      <w:r>
+        <w:t>se mostró como la empresa fue capaz de adoptar la era tecnológica para persistir con el paso del tiempo. Su estrategia fue implementar todas sus enciclopedias en digital bajo suscripción, manteniendo la idea de ser una fuente confiable y de calidad.</w:t>
       </w:r>
     </w:p>
     <w:p>
-      <w:r>
-        <w:lastRenderedPageBreak/>
-        <w:tab/>
-        <w:t xml:space="preserve">Más adelante </w:t>
-      </w:r>
-      <w:r>
-        <w:t>se mostró como la empresa fue capaz de adoptar la era tecnológica para persistir con el paso del tiempo. Su estrategia fue implementar todas sus enciclopedias en digital bajo suscripción, manteniendo la idea de ser una fuente confiable y de calidad.</w:t>
-      </w:r>
+      <w:pPr>
+        <w:pStyle w:val="Ttulo2"/>
+      </w:pPr>
+      <w:bookmarkStart w:id="3" w:name="_Toc239234988"/>
+      <w:r>
+        <w:t>Superar los ángulos muertos digitales</w:t>
+      </w:r>
+      <w:bookmarkEnd w:id="3"/>
     </w:p>
     <w:p>
-      <w:pPr>
-        <w:pStyle w:val="Ttulo2"/>
-      </w:pPr>
-      <w:r>
-        <w:t>Superar los ángulos muertos digitales</w:t>
+      <w:r>
+        <w:tab/>
+      </w:r>
+      <w:r>
+        <w:t xml:space="preserve">Se utiliza la siguiente analogía: Durate la primera ola de la Revolución Industrial, las fábricas dependían de fuentes de energía fijas, primero, de la energía fijas, primero, </w:t>
+      </w:r>
+      <w:r>
+        <w:t>de la</w:t>
+      </w:r>
+      <w:r>
+        <w:t xml:space="preserve"> en</w:t>
+      </w:r>
+      <w:r>
+        <w:t>er</w:t>
+      </w:r>
+      <w:r>
+        <w:t xml:space="preserve">gía hidráulica de las norias situadas a lo largo de los ríos y, más tarde, de la energía de vapor de los motores de carbón. Aunque estas fuentes de energía permitieron el aumento de la producción en masa, también establecieron limitaciones fundamentales. Al principio, determinaban dónde podían ser. </w:t>
+      </w:r>
+      <w:r>
+        <w:t>Además,</w:t>
+      </w:r>
+      <w:r>
+        <w:t xml:space="preserve"> dado que</w:t>
+      </w:r>
+      <w:r>
+        <w:t xml:space="preserve"> tanto las ruedas hidráulicas como los motores de vapor exigían que todo el equipo de una fábrica se acoplara a un eje de trasmisión central</w:t>
+      </w:r>
+      <w:r>
+        <w:t>, hacía que esas fuentes de energía determinaran el diseño de las fábricas y la forma n que se podría trabajar en ellas.</w:t>
       </w:r>
     </w:p>
     <w:p>
       <w:r>
         <w:tab/>
-      </w:r>
-      <w:r>
-        <w:t xml:space="preserve">Se utiliza la siguiente analogía: Durate la primera ola de la Revolución Industrial, las fábricas dependían de fuentes de energía fijas, primero, de la energía fijas, primero, </w:t>
-      </w:r>
-      <w:r>
-        <w:t>de la</w:t>
-      </w:r>
-      <w:r>
-        <w:t xml:space="preserve"> en</w:t>
-      </w:r>
-      <w:r>
-        <w:t>er</w:t>
-      </w:r>
-      <w:r>
-        <w:t xml:space="preserve">gía hidráulica de las norias situadas a lo largo de los ríos y, más tarde, de la energía de vapor de los motores de carbón. Aunque estas fuentes de energía permitieron el aumento de la producción en masa, también establecieron limitaciones fundamentales. Al principio, determinaban dónde podían ser. </w:t>
-      </w:r>
-      <w:r>
-        <w:t>Además,</w:t>
-      </w:r>
-      <w:r>
-        <w:t xml:space="preserve"> dado que</w:t>
-      </w:r>
-      <w:r>
-        <w:t xml:space="preserve"> tanto las ruedas hidráulicas como los motores de vapor exigían que todo el equipo de una fábrica se acoplara a un eje de trasmisión central</w:t>
-      </w:r>
-      <w:r>
-        <w:t>, hacía que esas fuentes de energía determinaran el diseño de las fábricas y la forma n que se podría trabajar en ellas.</w:t>
+        <w:t>Una vez que las instalaciones eléctricas se comenzaron a llegar a las fábricas los empresarios seguían aferrados a los diseños grandes de los que dependían anteriormente. Y se notó con las nuevas empresas que llegaron que innovaron con las nuevas tecnologías, y sigue pasando con las nuevas tecnologías que llegan.</w:t>
       </w:r>
     </w:p>
     <w:p>
-      <w:r>
-        <w:tab/>
-        <w:t>Una vez que las instalaciones eléctricas se comenzaron a llegar a las fábricas los empresarios seguían aferrados a los diseños grandes de los que dependían anteriormente. Y se notó con las nuevas empresas que llegaron que innovaron con las nuevas tecnologías, y sigue pasando con las nuevas tecnologías que llegan.</w:t>
-      </w:r>
-    </w:p>
-    <w:p>
       <w:pPr>
         <w:pStyle w:val="Ttulo2"/>
       </w:pPr>
+      <w:bookmarkStart w:id="4" w:name="_Toc239234989"/>
       <w:r>
         <w:t>Cinco dominios de la estrategia que la tecnología digital está cambiando</w:t>
       </w:r>
+      <w:bookmarkEnd w:id="4"/>
     </w:p>
     <w:p>
       <w:pPr>
@@ -2127,17 +2675,22 @@
           <w:tab w:val="left" w:pos="4800"/>
         </w:tabs>
       </w:pPr>
-      <w:r>
+      <w:bookmarkStart w:id="5" w:name="_Toc239234990"/>
+      <w:r>
+        <w:lastRenderedPageBreak/>
         <w:t>Los Cinco Dominios de la Transformación Digital</w:t>
       </w:r>
+      <w:bookmarkEnd w:id="5"/>
     </w:p>
     <w:p>
       <w:pPr>
         <w:pStyle w:val="Ttulo2"/>
       </w:pPr>
+      <w:bookmarkStart w:id="6" w:name="_Toc239234991"/>
       <w:r>
         <w:t>Clientes</w:t>
       </w:r>
+      <w:bookmarkEnd w:id="6"/>
     </w:p>
     <w:p>
       <w:r>
@@ -2147,20 +2700,18 @@
         <w:t xml:space="preserve">Antes, a los clientes se los trataba como un conglomerado de actores que eran independientes entre sí y las empresas producían para la mayor cantidad de personas que pudieran. Ahora los clientes </w:t>
       </w:r>
       <w:r>
-        <w:t xml:space="preserve">están dinámicamente conectados e interactúan de </w:t>
-      </w:r>
-      <w:r>
-        <w:lastRenderedPageBreak/>
-        <w:t>manera que cambian tanto las relaciones entre ellos como con las empresas, estos se influyen y determinan la reputación de las empresas y de las marcas.</w:t>
+        <w:t>están dinámicamente conectados e interactúan de manera que cambian tanto las relaciones entre ellos como con las empresas, estos se influyen y determinan la reputación de las empresas y de las marcas.</w:t>
       </w:r>
     </w:p>
     <w:p>
       <w:pPr>
         <w:pStyle w:val="Ttulo2"/>
       </w:pPr>
+      <w:bookmarkStart w:id="7" w:name="_Toc239234992"/>
       <w:r>
         <w:t>Competencia</w:t>
       </w:r>
+      <w:bookmarkEnd w:id="7"/>
     </w:p>
     <w:p>
       <w:r>
@@ -2181,70 +2732,362 @@
       <w:pPr>
         <w:pStyle w:val="Ttulo2"/>
       </w:pPr>
+      <w:bookmarkStart w:id="8" w:name="_Toc239234993"/>
       <w:r>
         <w:t>Datos</w:t>
       </w:r>
+      <w:bookmarkEnd w:id="8"/>
     </w:p>
     <w:p>
       <w:r>
         <w:tab/>
         <w:t xml:space="preserve">Anteriormente los datos se producían a través de una variedad de mediciones planificadas que se realizaban dentro de los </w:t>
       </w:r>
-      <w:proofErr w:type="spellStart"/>
-      <w:r>
-        <w:t>propiaos</w:t>
-      </w:r>
-      <w:proofErr w:type="spellEnd"/>
+      <w:r>
+        <w:t>propios</w:t>
+      </w:r>
       <w:r>
         <w:t xml:space="preserve"> procesos de una empresa: </w:t>
+      </w:r>
+      <w:r>
+        <w:t>fabricación, operaciones, ventas, comercialización. Los datos resultantes se utilizaban principalmente para evaluar, pronosticar y tomar decisiones.</w:t>
       </w:r>
     </w:p>
     <w:p>
-      <w:pPr>
-        <w:pStyle w:val="Ttulo1"/>
-      </w:pPr>
-      <w:bookmarkStart w:id="2" w:name="_Toc220850612"/>
-      <w:r>
-        <w:t>Conclusión</w:t>
-      </w:r>
-      <w:bookmarkEnd w:id="2"/>
+      <w:r>
+        <w:tab/>
+        <w:t>Sin embargo, hoy en día los datos se gestionan por montones, la mayoría de los datos disponibles para las empresas no se generan a través de una planificación sistemática, como un estudio de mercado; en su lugar, los datos se generan en cantidades sin precedentes a partir de cada interacción. Para poder manejar todos estos datos se necesitan herramientas de predicciones de tipo “Big Data”, busca patrones de comportamiento de los usuarios para realizar una deducción de tendencias o en busca de dónde va el mercado.</w:t>
+      </w:r>
     </w:p>
     <w:p>
       <w:pPr>
-        <w:spacing w:before="120" w:after="0"/>
-      </w:pPr>
-      <w:r>
-        <w:t>Hola soy una conclusión</w:t>
-      </w:r>
-      <w:r>
-        <w:t xml:space="preserve"> </w:t>
-      </w:r>
+        <w:pStyle w:val="Ttulo2"/>
+      </w:pPr>
+      <w:bookmarkStart w:id="9" w:name="_Toc239234994"/>
+      <w:r>
+        <w:t>Innovación</w:t>
+      </w:r>
+      <w:bookmarkEnd w:id="9"/>
     </w:p>
     <w:p>
-      <w:pPr>
-        <w:pStyle w:val="Ttulo1"/>
-      </w:pPr>
-      <w:bookmarkStart w:id="3" w:name="_Toc220850613"/>
-      <w:r>
-        <w:t>Bibliografía</w:t>
-      </w:r>
-      <w:bookmarkEnd w:id="3"/>
+      <w:r>
+        <w:tab/>
+        <w:t xml:space="preserve">La innovación es el proceso por el cual las empresas desarrollan y testean sus productos al mercado, </w:t>
+      </w:r>
+      <w:r>
+        <w:t xml:space="preserve">anteriormente esta etapa costaba más tiempo y recursos al depender de estudios que contenían métodos emergentes y que principalmente se </w:t>
+      </w:r>
+      <w:r>
+        <w:lastRenderedPageBreak/>
+        <w:t>basaban en las retroalimentaciones que proporcionaban los propios clientes. Ahora mismo, se pueden testear comportamientos físicos</w:t>
+      </w:r>
+      <w:r>
+        <w:t xml:space="preserve"> de los productos antes siquiera de haberlos fabricado por medio de simulaciones por computadora. La tecnología ha cambiado muchísimo la manera de como podemos </w:t>
+      </w:r>
+      <w:proofErr w:type="gramStart"/>
+      <w:r>
+        <w:t>probar  y</w:t>
+      </w:r>
+      <w:proofErr w:type="gramEnd"/>
+      <w:r>
+        <w:t xml:space="preserve"> fabricar novedosos productos antes de lanzarlos al mercado, incluso pudiendo predecir lo que los clientes pueden opinar al respecto</w:t>
+      </w:r>
+      <w:r>
+        <w:t>.</w:t>
+      </w:r>
     </w:p>
     <w:p>
+      <w:pPr>
+        <w:pStyle w:val="Ttulo1"/>
+      </w:pPr>
+      <w:bookmarkStart w:id="10" w:name="_Toc239234995"/>
+      <w:r>
+        <w:t>Una Guía Estratégica de la Transformación Digital</w:t>
+      </w:r>
+      <w:bookmarkEnd w:id="10"/>
+    </w:p>
+    <w:p>
+      <w:r>
+        <w:tab/>
+        <w:t>Las empresas de hoy en día claramente necesitan reformular cada una de las estrategias para dominar los cinco pilares de esta transformación digital. Para ello se utilizan las siguientes técnicas y sus conceptos clave:</w:t>
+      </w:r>
+    </w:p>
+    <w:p>
+      <w:pPr>
+        <w:pStyle w:val="Prrafodelista"/>
+        <w:numPr>
+          <w:ilvl w:val="0"/>
+          <w:numId w:val="33"/>
+        </w:numPr>
+      </w:pPr>
+      <w:r>
+        <w:t>Aprovechar las redes de clientes:</w:t>
+      </w:r>
+    </w:p>
+    <w:p>
+      <w:pPr>
+        <w:pStyle w:val="Prrafodelista"/>
+        <w:numPr>
+          <w:ilvl w:val="1"/>
+          <w:numId w:val="33"/>
+        </w:numPr>
+      </w:pPr>
+      <w:r>
+        <w:t xml:space="preserve">Innovar </w:t>
+      </w:r>
+      <w:r>
+        <w:t>la estrategia del marketing.</w:t>
+      </w:r>
+    </w:p>
+    <w:p>
+      <w:pPr>
+        <w:pStyle w:val="Prrafodelista"/>
+        <w:numPr>
+          <w:ilvl w:val="1"/>
+          <w:numId w:val="33"/>
+        </w:numPr>
+      </w:pPr>
+      <w:r>
+        <w:t>Analizar las rutas de compra.</w:t>
+      </w:r>
+    </w:p>
+    <w:p>
+      <w:pPr>
+        <w:pStyle w:val="Prrafodelista"/>
+        <w:numPr>
+          <w:ilvl w:val="1"/>
+          <w:numId w:val="33"/>
+        </w:numPr>
+      </w:pPr>
+      <w:r>
+        <w:t>Analizar los comportamientos centrales de los clientes y cuál es el punto de vista del producto.</w:t>
+      </w:r>
+    </w:p>
+    <w:p>
+      <w:pPr>
+        <w:pStyle w:val="Prrafodelista"/>
+        <w:numPr>
+          <w:ilvl w:val="0"/>
+          <w:numId w:val="33"/>
+        </w:numPr>
+      </w:pPr>
+      <w:r>
+        <w:t>Construir Plataformas y no solo productos</w:t>
+      </w:r>
+      <w:r>
+        <w:t>:</w:t>
+      </w:r>
+    </w:p>
+    <w:p>
+      <w:pPr>
+        <w:pStyle w:val="Prrafodelista"/>
+        <w:numPr>
+          <w:ilvl w:val="1"/>
+          <w:numId w:val="33"/>
+        </w:numPr>
+      </w:pPr>
+      <w:r>
+        <w:t>Modelos de negocio de plataforma</w:t>
+      </w:r>
+      <w:r>
+        <w:t>.</w:t>
+      </w:r>
+    </w:p>
+    <w:p>
+      <w:pPr>
+        <w:pStyle w:val="Prrafodelista"/>
+        <w:numPr>
+          <w:ilvl w:val="1"/>
+          <w:numId w:val="33"/>
+        </w:numPr>
+      </w:pPr>
+      <w:r>
+        <w:t>Efectos de red indirectos.</w:t>
+      </w:r>
+    </w:p>
+    <w:p>
+      <w:pPr>
+        <w:pStyle w:val="Prrafodelista"/>
+        <w:numPr>
+          <w:ilvl w:val="1"/>
+          <w:numId w:val="33"/>
+        </w:numPr>
+      </w:pPr>
+      <w:r>
+        <w:t>Trenes de valor.</w:t>
+      </w:r>
+    </w:p>
+    <w:p>
+      <w:pPr>
+        <w:pStyle w:val="Prrafodelista"/>
+        <w:numPr>
+          <w:ilvl w:val="0"/>
+          <w:numId w:val="33"/>
+        </w:numPr>
+      </w:pPr>
+      <w:r>
+        <w:t>Convertir los datos en activos:</w:t>
+      </w:r>
+    </w:p>
+    <w:p>
+      <w:pPr>
+        <w:pStyle w:val="Prrafodelista"/>
+        <w:numPr>
+          <w:ilvl w:val="1"/>
+          <w:numId w:val="33"/>
+        </w:numPr>
+      </w:pPr>
+      <w:r>
+        <w:t>Plantillas de valor de datos.</w:t>
+      </w:r>
+    </w:p>
+    <w:p>
+      <w:pPr>
+        <w:pStyle w:val="Prrafodelista"/>
+        <w:numPr>
+          <w:ilvl w:val="1"/>
+          <w:numId w:val="33"/>
+        </w:numPr>
+      </w:pPr>
+      <w:r>
+        <w:t>Impulsores de datos masivos.</w:t>
+      </w:r>
+    </w:p>
+    <w:p>
+      <w:pPr>
+        <w:pStyle w:val="Prrafodelista"/>
+        <w:numPr>
+          <w:ilvl w:val="1"/>
+          <w:numId w:val="33"/>
+        </w:numPr>
+      </w:pPr>
+      <w:r>
+        <w:t>La toma de decisiones basada en datos.</w:t>
+      </w:r>
+    </w:p>
+    <w:p>
+      <w:pPr>
+        <w:pStyle w:val="Prrafodelista"/>
+        <w:numPr>
+          <w:ilvl w:val="0"/>
+          <w:numId w:val="33"/>
+        </w:numPr>
+      </w:pPr>
+      <w:r>
+        <w:t>Innovar mediante una rápida experimentación:</w:t>
+      </w:r>
+    </w:p>
+    <w:p>
+      <w:pPr>
+        <w:pStyle w:val="Prrafodelista"/>
+        <w:numPr>
+          <w:ilvl w:val="1"/>
+          <w:numId w:val="33"/>
+        </w:numPr>
+      </w:pPr>
+      <w:r>
+        <w:t>Experimentación divergente.</w:t>
+      </w:r>
+    </w:p>
+    <w:p>
+      <w:pPr>
+        <w:pStyle w:val="Prrafodelista"/>
+        <w:numPr>
+          <w:ilvl w:val="1"/>
+          <w:numId w:val="33"/>
+        </w:numPr>
+      </w:pPr>
+      <w:r>
+        <w:t>Experimentación convergente.</w:t>
+      </w:r>
+    </w:p>
+    <w:p>
+      <w:pPr>
+        <w:pStyle w:val="Prrafodelista"/>
+        <w:numPr>
+          <w:ilvl w:val="1"/>
+          <w:numId w:val="33"/>
+        </w:numPr>
+      </w:pPr>
+      <w:r>
+        <w:t>Prototipo mínimo viable.</w:t>
+      </w:r>
+    </w:p>
+    <w:p>
+      <w:pPr>
+        <w:pStyle w:val="Prrafodelista"/>
+        <w:numPr>
+          <w:ilvl w:val="1"/>
+          <w:numId w:val="33"/>
+        </w:numPr>
+      </w:pPr>
+      <w:r>
+        <w:t>Rutas para la ampliación.</w:t>
+      </w:r>
+    </w:p>
+    <w:p>
+      <w:pPr>
+        <w:pStyle w:val="Prrafodelista"/>
+        <w:numPr>
+          <w:ilvl w:val="0"/>
+          <w:numId w:val="33"/>
+        </w:numPr>
+      </w:pPr>
+      <w:r>
+        <w:t>Adaptar tu propuesta de valor:</w:t>
+      </w:r>
+    </w:p>
+    <w:p>
+      <w:pPr>
+        <w:pStyle w:val="Prrafodelista"/>
+        <w:numPr>
+          <w:ilvl w:val="1"/>
+          <w:numId w:val="33"/>
+        </w:numPr>
+      </w:pPr>
+      <w:r>
+        <w:t>Conceptos de valor de mercado.</w:t>
+      </w:r>
+    </w:p>
+    <w:p>
+      <w:pPr>
+        <w:pStyle w:val="Prrafodelista"/>
+        <w:numPr>
+          <w:ilvl w:val="1"/>
+          <w:numId w:val="33"/>
+        </w:numPr>
+      </w:pPr>
+      <w:r>
+        <w:t>Rutas para salir de un mercado en declive.</w:t>
+      </w:r>
+    </w:p>
+    <w:p>
+      <w:pPr>
+        <w:pStyle w:val="Prrafodelista"/>
+        <w:numPr>
+          <w:ilvl w:val="1"/>
+          <w:numId w:val="33"/>
+        </w:numPr>
+      </w:pPr>
+      <w:r>
+        <w:t>Pasos para valorar la evolución de la hélice.</w:t>
+      </w:r>
+    </w:p>
+    <w:p>
+      <w:pPr>
+        <w:pStyle w:val="Ttulo1"/>
+      </w:pPr>
+      <w:bookmarkStart w:id="11" w:name="_Toc239234996"/>
+      <w:r>
+        <w:t>Bibliografía</w:t>
+      </w:r>
+      <w:bookmarkEnd w:id="11"/>
+    </w:p>
+    <w:p>
       <w:r>
         <w:t>Hola soy una bibliografía en formato APA</w:t>
       </w:r>
     </w:p>
-    <w:p/>
-    <w:p/>
-    <w:p/>
-    <w:p/>
-    <w:p/>
-    <w:p/>
-    <w:p/>
-    <w:p/>
-    <w:p/>
-    <w:p/>
     <w:sectPr>
       <w:headerReference w:type="even" r:id="rId12"/>
       <w:headerReference w:type="default" r:id="rId13"/>
@@ -2542,6 +3385,8 @@
     <w:pPr>
       <w:pStyle w:val="Encabezado"/>
       <w:jc w:val="right"/>
+    </w:pPr>
+    <w:r>
       <w:rPr>
         <w:rFonts w:asciiTheme="majorHAnsi" w:hAnsiTheme="majorHAnsi" w:cstheme="majorHAnsi"/>
         <w:b/>
@@ -2549,22 +3394,8 @@
         <w:sz w:val="28"/>
         <w:szCs w:val="32"/>
       </w:rPr>
-    </w:pPr>
-    <w:r>
-      <w:rPr>
-        <w:rFonts w:asciiTheme="majorHAnsi" w:hAnsiTheme="majorHAnsi" w:cstheme="majorHAnsi"/>
-        <w:b/>
-        <w:bCs/>
-        <w:sz w:val="28"/>
-        <w:szCs w:val="32"/>
-      </w:rPr>
-      <w:t>Sistemas Operativos</w:t>
+      <w:t>Innovación y Tecnología</w:t>
     </w:r>
-  </w:p>
-  <w:p>
-    <w:pPr>
-      <w:pStyle w:val="Encabezado"/>
-    </w:pPr>
   </w:p>
 </w:hdr>
 </file>
@@ -2949,6 +3780,119 @@
     </w:lvl>
   </w:abstractNum>
   <w:abstractNum w:abstractNumId="4" w15:restartNumberingAfterBreak="0">
+    <w:nsid w:val="0DAE002A"/>
+    <w:multiLevelType w:val="hybridMultilevel"/>
+    <w:tmpl w:val="EA60E5A2"/>
+    <w:lvl w:ilvl="0" w:tplc="080A0001">
+      <w:start w:val="1"/>
+      <w:numFmt w:val="bullet"/>
+      <w:lvlText w:val=""/>
+      <w:lvlJc w:val="left"/>
+      <w:pPr>
+        <w:ind w:left="720" w:hanging="360"/>
+      </w:pPr>
+      <w:rPr>
+        <w:rFonts w:ascii="Symbol" w:hAnsi="Symbol" w:hint="default"/>
+      </w:rPr>
+    </w:lvl>
+    <w:lvl w:ilvl="1" w:tplc="080A0003">
+      <w:start w:val="1"/>
+      <w:numFmt w:val="bullet"/>
+      <w:lvlText w:val="o"/>
+      <w:lvlJc w:val="left"/>
+      <w:pPr>
+        <w:ind w:left="1440" w:hanging="360"/>
+      </w:pPr>
+      <w:rPr>
+        <w:rFonts w:ascii="Courier New" w:hAnsi="Courier New" w:cs="Courier New" w:hint="default"/>
+      </w:rPr>
+    </w:lvl>
+    <w:lvl w:ilvl="2" w:tplc="080A0005">
+      <w:start w:val="1"/>
+      <w:numFmt w:val="bullet"/>
+      <w:lvlText w:val=""/>
+      <w:lvlJc w:val="left"/>
+      <w:pPr>
+        <w:ind w:left="2160" w:hanging="360"/>
+      </w:pPr>
+      <w:rPr>
+        <w:rFonts w:ascii="Wingdings" w:hAnsi="Wingdings" w:hint="default"/>
+      </w:rPr>
+    </w:lvl>
+    <w:lvl w:ilvl="3" w:tplc="080A0001" w:tentative="1">
+      <w:start w:val="1"/>
+      <w:numFmt w:val="bullet"/>
+      <w:lvlText w:val=""/>
+      <w:lvlJc w:val="left"/>
+      <w:pPr>
+        <w:ind w:left="2880" w:hanging="360"/>
+      </w:pPr>
+      <w:rPr>
+        <w:rFonts w:ascii="Symbol" w:hAnsi="Symbol" w:hint="default"/>
+      </w:rPr>
+    </w:lvl>
+    <w:lvl w:ilvl="4" w:tplc="080A0003" w:tentative="1">
+      <w:start w:val="1"/>
+      <w:numFmt w:val="bullet"/>
+      <w:lvlText w:val="o"/>
+      <w:lvlJc w:val="left"/>
+      <w:pPr>
+        <w:ind w:left="3600" w:hanging="360"/>
+      </w:pPr>
+      <w:rPr>
+        <w:rFonts w:ascii="Courier New" w:hAnsi="Courier New" w:cs="Courier New" w:hint="default"/>
+      </w:rPr>
+    </w:lvl>
+    <w:lvl w:ilvl="5" w:tplc="080A0005" w:tentative="1">
+      <w:start w:val="1"/>
+      <w:numFmt w:val="bullet"/>
+      <w:lvlText w:val=""/>
+      <w:lvlJc w:val="left"/>
+      <w:pPr>
+        <w:ind w:left="4320" w:hanging="360"/>
+      </w:pPr>
+      <w:rPr>
+        <w:rFonts w:ascii="Wingdings" w:hAnsi="Wingdings" w:hint="default"/>
+      </w:rPr>
+    </w:lvl>
+    <w:lvl w:ilvl="6" w:tplc="080A0001" w:tentative="1">
+      <w:start w:val="1"/>
+      <w:numFmt w:val="bullet"/>
+      <w:lvlText w:val=""/>
+      <w:lvlJc w:val="left"/>
+      <w:pPr>
+        <w:ind w:left="5040" w:hanging="360"/>
+      </w:pPr>
+      <w:rPr>
+        <w:rFonts w:ascii="Symbol" w:hAnsi="Symbol" w:hint="default"/>
+      </w:rPr>
+    </w:lvl>
+    <w:lvl w:ilvl="7" w:tplc="080A0003" w:tentative="1">
+      <w:start w:val="1"/>
+      <w:numFmt w:val="bullet"/>
+      <w:lvlText w:val="o"/>
+      <w:lvlJc w:val="left"/>
+      <w:pPr>
+        <w:ind w:left="5760" w:hanging="360"/>
+      </w:pPr>
+      <w:rPr>
+        <w:rFonts w:ascii="Courier New" w:hAnsi="Courier New" w:cs="Courier New" w:hint="default"/>
+      </w:rPr>
+    </w:lvl>
+    <w:lvl w:ilvl="8" w:tplc="080A0005" w:tentative="1">
+      <w:start w:val="1"/>
+      <w:numFmt w:val="bullet"/>
+      <w:lvlText w:val=""/>
+      <w:lvlJc w:val="left"/>
+      <w:pPr>
+        <w:ind w:left="6480" w:hanging="360"/>
+      </w:pPr>
+      <w:rPr>
+        <w:rFonts w:ascii="Wingdings" w:hAnsi="Wingdings" w:hint="default"/>
+      </w:rPr>
+    </w:lvl>
+  </w:abstractNum>
+  <w:abstractNum w:abstractNumId="5" w15:restartNumberingAfterBreak="0">
     <w:nsid w:val="0F695D61"/>
     <w:multiLevelType w:val="hybridMultilevel"/>
     <w:tmpl w:val="252EDE04"/>
@@ -3034,7 +3978,7 @@
       </w:pPr>
     </w:lvl>
   </w:abstractNum>
-  <w:abstractNum w:abstractNumId="5" w15:restartNumberingAfterBreak="0">
+  <w:abstractNum w:abstractNumId="6" w15:restartNumberingAfterBreak="0">
     <w:nsid w:val="11081312"/>
     <w:multiLevelType w:val="hybridMultilevel"/>
     <w:tmpl w:val="9E5816B2"/>
@@ -3120,7 +4064,7 @@
       </w:pPr>
     </w:lvl>
   </w:abstractNum>
-  <w:abstractNum w:abstractNumId="6" w15:restartNumberingAfterBreak="0">
+  <w:abstractNum w:abstractNumId="7" w15:restartNumberingAfterBreak="0">
     <w:nsid w:val="15B75010"/>
     <w:multiLevelType w:val="hybridMultilevel"/>
     <w:tmpl w:val="85520E40"/>
@@ -3233,7 +4177,7 @@
       </w:rPr>
     </w:lvl>
   </w:abstractNum>
-  <w:abstractNum w:abstractNumId="7" w15:restartNumberingAfterBreak="0">
+  <w:abstractNum w:abstractNumId="8" w15:restartNumberingAfterBreak="0">
     <w:nsid w:val="1AEC06E6"/>
     <w:multiLevelType w:val="hybridMultilevel"/>
     <w:tmpl w:val="CDD8829A"/>
@@ -3346,7 +4290,7 @@
       </w:rPr>
     </w:lvl>
   </w:abstractNum>
-  <w:abstractNum w:abstractNumId="8" w15:restartNumberingAfterBreak="0">
+  <w:abstractNum w:abstractNumId="9" w15:restartNumberingAfterBreak="0">
     <w:nsid w:val="2357072B"/>
     <w:multiLevelType w:val="hybridMultilevel"/>
     <w:tmpl w:val="383E2788"/>
@@ -3459,7 +4403,7 @@
       </w:rPr>
     </w:lvl>
   </w:abstractNum>
-  <w:abstractNum w:abstractNumId="9" w15:restartNumberingAfterBreak="0">
+  <w:abstractNum w:abstractNumId="10" w15:restartNumberingAfterBreak="0">
     <w:nsid w:val="252C402B"/>
     <w:multiLevelType w:val="hybridMultilevel"/>
     <w:tmpl w:val="E3828E10"/>
@@ -3572,7 +4516,7 @@
       </w:rPr>
     </w:lvl>
   </w:abstractNum>
-  <w:abstractNum w:abstractNumId="10" w15:restartNumberingAfterBreak="0">
+  <w:abstractNum w:abstractNumId="11" w15:restartNumberingAfterBreak="0">
     <w:nsid w:val="26704FAC"/>
     <w:multiLevelType w:val="hybridMultilevel"/>
     <w:tmpl w:val="78A259AE"/>
@@ -3685,7 +4629,7 @@
       </w:rPr>
     </w:lvl>
   </w:abstractNum>
-  <w:abstractNum w:abstractNumId="11" w15:restartNumberingAfterBreak="0">
+  <w:abstractNum w:abstractNumId="12" w15:restartNumberingAfterBreak="0">
     <w:nsid w:val="27A2319E"/>
     <w:multiLevelType w:val="hybridMultilevel"/>
     <w:tmpl w:val="E974ABBC"/>
@@ -3798,7 +4742,7 @@
       </w:rPr>
     </w:lvl>
   </w:abstractNum>
-  <w:abstractNum w:abstractNumId="12" w15:restartNumberingAfterBreak="0">
+  <w:abstractNum w:abstractNumId="13" w15:restartNumberingAfterBreak="0">
     <w:nsid w:val="2A4E31E0"/>
     <w:multiLevelType w:val="hybridMultilevel"/>
     <w:tmpl w:val="595C7D88"/>
@@ -3911,7 +4855,7 @@
       </w:rPr>
     </w:lvl>
   </w:abstractNum>
-  <w:abstractNum w:abstractNumId="13" w15:restartNumberingAfterBreak="0">
+  <w:abstractNum w:abstractNumId="14" w15:restartNumberingAfterBreak="0">
     <w:nsid w:val="2C0B5195"/>
     <w:multiLevelType w:val="hybridMultilevel"/>
     <w:tmpl w:val="FE9C5F14"/>
@@ -4024,7 +4968,7 @@
       </w:rPr>
     </w:lvl>
   </w:abstractNum>
-  <w:abstractNum w:abstractNumId="14" w15:restartNumberingAfterBreak="0">
+  <w:abstractNum w:abstractNumId="15" w15:restartNumberingAfterBreak="0">
     <w:nsid w:val="32E8256A"/>
     <w:multiLevelType w:val="hybridMultilevel"/>
     <w:tmpl w:val="35B27F0C"/>
@@ -4137,7 +5081,7 @@
       </w:rPr>
     </w:lvl>
   </w:abstractNum>
-  <w:abstractNum w:abstractNumId="15" w15:restartNumberingAfterBreak="0">
+  <w:abstractNum w:abstractNumId="16" w15:restartNumberingAfterBreak="0">
     <w:nsid w:val="3D2C0E66"/>
     <w:multiLevelType w:val="hybridMultilevel"/>
     <w:tmpl w:val="324A86FE"/>
@@ -4250,7 +5194,7 @@
       </w:rPr>
     </w:lvl>
   </w:abstractNum>
-  <w:abstractNum w:abstractNumId="16" w15:restartNumberingAfterBreak="0">
+  <w:abstractNum w:abstractNumId="17" w15:restartNumberingAfterBreak="0">
     <w:nsid w:val="3D4950BC"/>
     <w:multiLevelType w:val="hybridMultilevel"/>
     <w:tmpl w:val="32C636D8"/>
@@ -4363,7 +5307,7 @@
       </w:rPr>
     </w:lvl>
   </w:abstractNum>
-  <w:abstractNum w:abstractNumId="17" w15:restartNumberingAfterBreak="0">
+  <w:abstractNum w:abstractNumId="18" w15:restartNumberingAfterBreak="0">
     <w:nsid w:val="3EE357D5"/>
     <w:multiLevelType w:val="hybridMultilevel"/>
     <w:tmpl w:val="B06250B4"/>
@@ -4476,7 +5420,7 @@
       </w:rPr>
     </w:lvl>
   </w:abstractNum>
-  <w:abstractNum w:abstractNumId="18" w15:restartNumberingAfterBreak="0">
+  <w:abstractNum w:abstractNumId="19" w15:restartNumberingAfterBreak="0">
     <w:nsid w:val="432058A2"/>
     <w:multiLevelType w:val="hybridMultilevel"/>
     <w:tmpl w:val="EC5621DC"/>
@@ -4589,7 +5533,7 @@
       </w:rPr>
     </w:lvl>
   </w:abstractNum>
-  <w:abstractNum w:abstractNumId="19" w15:restartNumberingAfterBreak="0">
+  <w:abstractNum w:abstractNumId="20" w15:restartNumberingAfterBreak="0">
     <w:nsid w:val="45C55BFE"/>
     <w:multiLevelType w:val="hybridMultilevel"/>
     <w:tmpl w:val="D92E599C"/>
@@ -4702,7 +5646,7 @@
       </w:rPr>
     </w:lvl>
   </w:abstractNum>
-  <w:abstractNum w:abstractNumId="20" w15:restartNumberingAfterBreak="0">
+  <w:abstractNum w:abstractNumId="21" w15:restartNumberingAfterBreak="0">
     <w:nsid w:val="4789116B"/>
     <w:multiLevelType w:val="hybridMultilevel"/>
     <w:tmpl w:val="F5D0E744"/>
@@ -4815,7 +5759,7 @@
       </w:rPr>
     </w:lvl>
   </w:abstractNum>
-  <w:abstractNum w:abstractNumId="21" w15:restartNumberingAfterBreak="0">
+  <w:abstractNum w:abstractNumId="22" w15:restartNumberingAfterBreak="0">
     <w:nsid w:val="4FA653D3"/>
     <w:multiLevelType w:val="hybridMultilevel"/>
     <w:tmpl w:val="2F145B30"/>
@@ -4904,7 +5848,7 @@
       </w:pPr>
     </w:lvl>
   </w:abstractNum>
-  <w:abstractNum w:abstractNumId="22" w15:restartNumberingAfterBreak="0">
+  <w:abstractNum w:abstractNumId="23" w15:restartNumberingAfterBreak="0">
     <w:nsid w:val="5C614E09"/>
     <w:multiLevelType w:val="hybridMultilevel"/>
     <w:tmpl w:val="C6F0588A"/>
@@ -4990,7 +5934,7 @@
       </w:pPr>
     </w:lvl>
   </w:abstractNum>
-  <w:abstractNum w:abstractNumId="23" w15:restartNumberingAfterBreak="0">
+  <w:abstractNum w:abstractNumId="24" w15:restartNumberingAfterBreak="0">
     <w:nsid w:val="5D0303E9"/>
     <w:multiLevelType w:val="hybridMultilevel"/>
     <w:tmpl w:val="7BF8642E"/>
@@ -5076,7 +6020,7 @@
       </w:pPr>
     </w:lvl>
   </w:abstractNum>
-  <w:abstractNum w:abstractNumId="24" w15:restartNumberingAfterBreak="0">
+  <w:abstractNum w:abstractNumId="25" w15:restartNumberingAfterBreak="0">
     <w:nsid w:val="5D3E675A"/>
     <w:multiLevelType w:val="hybridMultilevel"/>
     <w:tmpl w:val="531CDDE4"/>
@@ -5189,7 +6133,7 @@
       </w:rPr>
     </w:lvl>
   </w:abstractNum>
-  <w:abstractNum w:abstractNumId="25" w15:restartNumberingAfterBreak="0">
+  <w:abstractNum w:abstractNumId="26" w15:restartNumberingAfterBreak="0">
     <w:nsid w:val="5E2162D0"/>
     <w:multiLevelType w:val="hybridMultilevel"/>
     <w:tmpl w:val="19F640F0"/>
@@ -5302,7 +6246,7 @@
       </w:rPr>
     </w:lvl>
   </w:abstractNum>
-  <w:abstractNum w:abstractNumId="26" w15:restartNumberingAfterBreak="0">
+  <w:abstractNum w:abstractNumId="27" w15:restartNumberingAfterBreak="0">
     <w:nsid w:val="63520ADD"/>
     <w:multiLevelType w:val="hybridMultilevel"/>
     <w:tmpl w:val="D97630C4"/>
@@ -5415,7 +6359,7 @@
       </w:rPr>
     </w:lvl>
   </w:abstractNum>
-  <w:abstractNum w:abstractNumId="27" w15:restartNumberingAfterBreak="0">
+  <w:abstractNum w:abstractNumId="28" w15:restartNumberingAfterBreak="0">
     <w:nsid w:val="67A32EBF"/>
     <w:multiLevelType w:val="hybridMultilevel"/>
     <w:tmpl w:val="127C7076"/>
@@ -5528,7 +6472,7 @@
       </w:rPr>
     </w:lvl>
   </w:abstractNum>
-  <w:abstractNum w:abstractNumId="28" w15:restartNumberingAfterBreak="0">
+  <w:abstractNum w:abstractNumId="29" w15:restartNumberingAfterBreak="0">
     <w:nsid w:val="6E6F759E"/>
     <w:multiLevelType w:val="hybridMultilevel"/>
     <w:tmpl w:val="1CA448FC"/>
@@ -5641,7 +6585,7 @@
       </w:rPr>
     </w:lvl>
   </w:abstractNum>
-  <w:abstractNum w:abstractNumId="29" w15:restartNumberingAfterBreak="0">
+  <w:abstractNum w:abstractNumId="30" w15:restartNumberingAfterBreak="0">
     <w:nsid w:val="784530C1"/>
     <w:multiLevelType w:val="hybridMultilevel"/>
     <w:tmpl w:val="3CF6FE18"/>
@@ -5754,7 +6698,7 @@
       </w:rPr>
     </w:lvl>
   </w:abstractNum>
-  <w:abstractNum w:abstractNumId="30" w15:restartNumberingAfterBreak="0">
+  <w:abstractNum w:abstractNumId="31" w15:restartNumberingAfterBreak="0">
     <w:nsid w:val="7C226B17"/>
     <w:multiLevelType w:val="hybridMultilevel"/>
     <w:tmpl w:val="316EBF58"/>
@@ -5867,7 +6811,7 @@
       </w:rPr>
     </w:lvl>
   </w:abstractNum>
-  <w:abstractNum w:abstractNumId="31" w15:restartNumberingAfterBreak="0">
+  <w:abstractNum w:abstractNumId="32" w15:restartNumberingAfterBreak="0">
     <w:nsid w:val="7C7324D3"/>
     <w:multiLevelType w:val="hybridMultilevel"/>
     <w:tmpl w:val="FBB601F2"/>
@@ -5981,100 +6925,103 @@
     </w:lvl>
   </w:abstractNum>
   <w:num w:numId="1" w16cid:durableId="1507473298">
+    <w:abstractNumId w:val="6"/>
+  </w:num>
+  <w:num w:numId="2" w16cid:durableId="1810004600">
     <w:abstractNumId w:val="5"/>
   </w:num>
-  <w:num w:numId="2" w16cid:durableId="1810004600">
-    <w:abstractNumId w:val="4"/>
-  </w:num>
   <w:num w:numId="3" w16cid:durableId="1516307261">
-    <w:abstractNumId w:val="27"/>
+    <w:abstractNumId w:val="28"/>
   </w:num>
   <w:num w:numId="4" w16cid:durableId="263998001">
-    <w:abstractNumId w:val="29"/>
+    <w:abstractNumId w:val="30"/>
   </w:num>
   <w:num w:numId="5" w16cid:durableId="1694530711">
     <w:abstractNumId w:val="3"/>
   </w:num>
   <w:num w:numId="6" w16cid:durableId="399212304">
-    <w:abstractNumId w:val="26"/>
+    <w:abstractNumId w:val="27"/>
   </w:num>
   <w:num w:numId="7" w16cid:durableId="1510755812">
-    <w:abstractNumId w:val="31"/>
+    <w:abstractNumId w:val="32"/>
   </w:num>
   <w:num w:numId="8" w16cid:durableId="401295270">
-    <w:abstractNumId w:val="28"/>
+    <w:abstractNumId w:val="29"/>
   </w:num>
   <w:num w:numId="9" w16cid:durableId="1237131580">
-    <w:abstractNumId w:val="16"/>
+    <w:abstractNumId w:val="17"/>
   </w:num>
   <w:num w:numId="10" w16cid:durableId="1815832771">
-    <w:abstractNumId w:val="19"/>
+    <w:abstractNumId w:val="20"/>
   </w:num>
   <w:num w:numId="11" w16cid:durableId="1210530553">
-    <w:abstractNumId w:val="10"/>
+    <w:abstractNumId w:val="11"/>
   </w:num>
   <w:num w:numId="12" w16cid:durableId="709888915">
-    <w:abstractNumId w:val="15"/>
+    <w:abstractNumId w:val="16"/>
   </w:num>
   <w:num w:numId="13" w16cid:durableId="1638875566">
     <w:abstractNumId w:val="0"/>
   </w:num>
   <w:num w:numId="14" w16cid:durableId="1857187464">
-    <w:abstractNumId w:val="11"/>
+    <w:abstractNumId w:val="12"/>
   </w:num>
   <w:num w:numId="15" w16cid:durableId="1398281611">
+    <w:abstractNumId w:val="10"/>
+  </w:num>
+  <w:num w:numId="16" w16cid:durableId="2101368299">
+    <w:abstractNumId w:val="26"/>
+  </w:num>
+  <w:num w:numId="17" w16cid:durableId="1383942363">
+    <w:abstractNumId w:val="15"/>
+  </w:num>
+  <w:num w:numId="18" w16cid:durableId="975914109">
+    <w:abstractNumId w:val="19"/>
+  </w:num>
+  <w:num w:numId="19" w16cid:durableId="707417816">
+    <w:abstractNumId w:val="23"/>
+  </w:num>
+  <w:num w:numId="20" w16cid:durableId="1331831440">
+    <w:abstractNumId w:val="8"/>
+  </w:num>
+  <w:num w:numId="21" w16cid:durableId="1910534101">
+    <w:abstractNumId w:val="31"/>
+  </w:num>
+  <w:num w:numId="22" w16cid:durableId="124473379">
     <w:abstractNumId w:val="9"/>
   </w:num>
-  <w:num w:numId="16" w16cid:durableId="2101368299">
+  <w:num w:numId="23" w16cid:durableId="256406080">
     <w:abstractNumId w:val="25"/>
-  </w:num>
-  <w:num w:numId="17" w16cid:durableId="1383942363">
-    <w:abstractNumId w:val="14"/>
-  </w:num>
-  <w:num w:numId="18" w16cid:durableId="975914109">
-    <w:abstractNumId w:val="18"/>
-  </w:num>
-  <w:num w:numId="19" w16cid:durableId="707417816">
-    <w:abstractNumId w:val="22"/>
-  </w:num>
-  <w:num w:numId="20" w16cid:durableId="1331831440">
-    <w:abstractNumId w:val="7"/>
-  </w:num>
-  <w:num w:numId="21" w16cid:durableId="1910534101">
-    <w:abstractNumId w:val="30"/>
-  </w:num>
-  <w:num w:numId="22" w16cid:durableId="124473379">
-    <w:abstractNumId w:val="8"/>
-  </w:num>
-  <w:num w:numId="23" w16cid:durableId="256406080">
-    <w:abstractNumId w:val="24"/>
   </w:num>
   <w:num w:numId="24" w16cid:durableId="1952279886">
     <w:abstractNumId w:val="1"/>
   </w:num>
   <w:num w:numId="25" w16cid:durableId="667830043">
-    <w:abstractNumId w:val="6"/>
+    <w:abstractNumId w:val="7"/>
   </w:num>
   <w:num w:numId="26" w16cid:durableId="200168938">
-    <w:abstractNumId w:val="17"/>
+    <w:abstractNumId w:val="18"/>
   </w:num>
   <w:num w:numId="27" w16cid:durableId="240065754">
-    <w:abstractNumId w:val="13"/>
+    <w:abstractNumId w:val="14"/>
   </w:num>
   <w:num w:numId="28" w16cid:durableId="1593396341">
-    <w:abstractNumId w:val="23"/>
+    <w:abstractNumId w:val="24"/>
   </w:num>
   <w:num w:numId="29" w16cid:durableId="36511375">
-    <w:abstractNumId w:val="21"/>
+    <w:abstractNumId w:val="22"/>
   </w:num>
   <w:num w:numId="30" w16cid:durableId="853804131">
     <w:abstractNumId w:val="2"/>
   </w:num>
   <w:num w:numId="31" w16cid:durableId="1256211548">
-    <w:abstractNumId w:val="20"/>
+    <w:abstractNumId w:val="21"/>
   </w:num>
   <w:num w:numId="32" w16cid:durableId="1482887219">
-    <w:abstractNumId w:val="12"/>
+    <w:abstractNumId w:val="13"/>
+  </w:num>
+  <w:num w:numId="33" w16cid:durableId="1072511049">
+    <w:abstractNumId w:val="4"/>
   </w:num>
   <w:numIdMacAtCleanup w:val="13"/>
 </w:numbering>

</xml_diff>